<commit_message>
Continuación estado del arte
Se ha continuado con el estado del arte hablando del funcionamiento de las narices electrónicas y de los sensores.
</commit_message>
<xml_diff>
--- a/Apuntes_NaricesElectronicas.docx
+++ b/Apuntes_NaricesElectronicas.docx
@@ -52,7 +52,15 @@
         <w:t>S</w:t>
       </w:r>
       <w:r>
-        <w:t>e considera parte de un área de investigación llamada biomímesis,</w:t>
+        <w:t xml:space="preserve">e considera parte de un área de investigación llamada </w:t>
+      </w:r>
+      <w:proofErr w:type="spellStart"/>
+      <w:r>
+        <w:t>biomímesis</w:t>
+      </w:r>
+      <w:proofErr w:type="spellEnd"/>
+      <w:r>
+        <w:t>,</w:t>
       </w:r>
     </w:p>
     <w:p>
@@ -76,7 +84,15 @@
         </w:numPr>
       </w:pPr>
       <w:r>
-        <w:t>Para imitar el comportamiento de la nariz humana se toma como base una serie de sensores combinados con algoritmos y patrones de reconocimiento. Los sensores utilizados son, mayoritariamente, semiconductores de óxido metálico, detectores de fotoionización, biosensores, nanotecnología y otros. Cada uno tiene  sus ventajas e inconvenientes en función de las aplicaciones que se le quieran dar.</w:t>
+        <w:t xml:space="preserve">Para imitar el comportamiento de la nariz humana se toma como base una serie de sensores combinados con algoritmos y patrones de reconocimiento. Los sensores utilizados son, mayoritariamente, semiconductores de óxido metálico, detectores de fotoionización, biosensores, nanotecnología y otros. Cada uno </w:t>
+      </w:r>
+      <w:proofErr w:type="gramStart"/>
+      <w:r>
+        <w:t>tiene  sus</w:t>
+      </w:r>
+      <w:proofErr w:type="gramEnd"/>
+      <w:r>
+        <w:t xml:space="preserve"> ventajas e inconvenientes en función de las aplicaciones que se le quieran dar.</w:t>
       </w:r>
     </w:p>
     <w:p>
@@ -276,7 +292,15 @@
         </w:numPr>
       </w:pPr>
       <w:r>
-        <w:t>La nariz electrónica se define como un instrumento dotado de sensores químicos y de un programa quimiométrico de reconocimiento de modelos, que es capaz de reconocer y comparar olores individuales o complejos.</w:t>
+        <w:t xml:space="preserve">La nariz electrónica se define como un instrumento dotado de sensores químicos y de un programa </w:t>
+      </w:r>
+      <w:proofErr w:type="spellStart"/>
+      <w:r>
+        <w:t>quimiométrico</w:t>
+      </w:r>
+      <w:proofErr w:type="spellEnd"/>
+      <w:r>
+        <w:t xml:space="preserve"> de reconocimiento de modelos, que es capaz de reconocer y comparar olores individuales o complejos.</w:t>
       </w:r>
     </w:p>
     <w:p>
@@ -288,7 +312,31 @@
         </w:numPr>
       </w:pPr>
       <w:r>
-        <w:t xml:space="preserve">Tradicionalmente, el aroma de los alimentos se ha analizado empleando técnicas de análisis sensorial y/o técnicas cromatográficas con sistemas de detección universal como la espectrometría de masas(MS) o la ionización de llama (FID). Estas últimas han sido, además, las que han permitido cuantificar los componentes individualizados que constituyen la fracción volátil del alimento. En los últimos años, otras técnicas como la cromatografía de gases con detección olfatimétrica (GCO) han complementado los resultados de las técnicas más clásicas, puesto que han permitido cuantificar los componentes volátiles pero, además, identificar aquellos que aportan alguna nota aromática al alimento en cuestión. Es decir, la GCO podría considerarse un punto intermedio entre el análisis sensorial y las técnicas cromatográficas. No obstante, esta técnica, como técnica cromatográfica que es, adolece de una falta de rapidez analítica que la hace poco útil en control de calidad. La nariz electrónica, sin embargo, sí </w:t>
+        <w:t xml:space="preserve">Tradicionalmente, el aroma de los alimentos se ha analizado empleando técnicas de análisis sensorial y/o técnicas cromatográficas con sistemas de detección universal como la espectrometría de </w:t>
+      </w:r>
+      <w:proofErr w:type="gramStart"/>
+      <w:r>
+        <w:t>masas(</w:t>
+      </w:r>
+      <w:proofErr w:type="gramEnd"/>
+      <w:r>
+        <w:t xml:space="preserve">MS) o la ionización de llama (FID). Estas últimas han sido, además, las que han permitido cuantificar los componentes individualizados que constituyen la fracción volátil del alimento. En los últimos años, otras técnicas como la cromatografía de gases con detección </w:t>
+      </w:r>
+      <w:proofErr w:type="spellStart"/>
+      <w:r>
+        <w:t>olfatimétrica</w:t>
+      </w:r>
+      <w:proofErr w:type="spellEnd"/>
+      <w:r>
+        <w:t xml:space="preserve"> (GCO) han complementado los resultados de las técnicas más clásicas, puesto que han permitido cuantificar los componentes </w:t>
+      </w:r>
+      <w:proofErr w:type="gramStart"/>
+      <w:r>
+        <w:t>volátiles</w:t>
+      </w:r>
+      <w:proofErr w:type="gramEnd"/>
+      <w:r>
+        <w:t xml:space="preserve"> pero, además, identificar aquellos que aportan alguna nota aromática al alimento en cuestión. Es decir, la GCO podría considerarse un punto intermedio entre el análisis sensorial y las técnicas cromatográficas. No obstante, esta técnica, como técnica cromatográfica que es, adolece de una falta de rapidez analítica que la hace poco útil en control de calidad. La nariz electrónica, sin embargo, sí </w:t>
       </w:r>
       <w:r>
         <w:lastRenderedPageBreak/>
@@ -304,7 +352,23 @@
         </w:numPr>
       </w:pPr>
       <w:r>
-        <w:t>Los volátiles, concentrados por calentamiento en la fase vapor que está sobre la muestra (líquida o sólida) son introducidos en el sistema de sensores que medirá las diferentes propiedades físico-químicas de los componentes del aroma, convirtiendo el olor en la señal mensurable que un ordenador se encargará de procesar –mediante técnicas quimiométricas–, proporcionando un gráfico que representará la huella digital de dicho olor. Así pues, toma de muestra, conjunto de sensores y sistema de tratamiento de datos serán las partes esenciales de cualquier tipo de nariz electrónica comercial.</w:t>
+        <w:t xml:space="preserve">Los volátiles, concentrados por calentamiento en la fase vapor que está sobre la muestra (líquida o sólida) son introducidos en el sistema de sensores que medirá las diferentes propiedades </w:t>
+      </w:r>
+      <w:proofErr w:type="gramStart"/>
+      <w:r>
+        <w:t>físico-químicas</w:t>
+      </w:r>
+      <w:proofErr w:type="gramEnd"/>
+      <w:r>
+        <w:t xml:space="preserve"> de los componentes del aroma, convirtiendo el olor en la señal mensurable que un ordenador se encargará de procesar –mediante técnicas </w:t>
+      </w:r>
+      <w:proofErr w:type="spellStart"/>
+      <w:r>
+        <w:t>quimiométricas</w:t>
+      </w:r>
+      <w:proofErr w:type="spellEnd"/>
+      <w:r>
+        <w:t>–, proporcionando un gráfico que representará la huella digital de dicho olor. Así pues, toma de muestra, conjunto de sensores y sistema de tratamiento de datos serán las partes esenciales de cualquier tipo de nariz electrónica comercial.</w:t>
       </w:r>
     </w:p>
     <w:p>
@@ -316,7 +380,15 @@
         </w:numPr>
       </w:pPr>
       <w:r>
-        <w:t xml:space="preserve">La diferencia fundamental entre los sistemas de olfato electrónico reside en la tipología de los sensores empleados. Los llamados sensores de gases son los más consolidados. Estos sensores, que funcionan en batería (sistemas multisensor) y están constituidos por diferentes materiales (óxidos metálicos, polímeros conductores, cristales piezoeléctricos, etc.), modifican sus propiedades eléctricas cuando interaccionan con los compuestos volátiles, proporcionando una </w:t>
+        <w:t xml:space="preserve">La diferencia fundamental entre los sistemas de olfato electrónico reside en la tipología de los sensores empleados. Los llamados sensores de gases son los más consolidados. Estos sensores, que funcionan en batería (sistemas </w:t>
+      </w:r>
+      <w:proofErr w:type="spellStart"/>
+      <w:r>
+        <w:t>multisensor</w:t>
+      </w:r>
+      <w:proofErr w:type="spellEnd"/>
+      <w:r>
+        <w:t xml:space="preserve">) y están constituidos por diferentes materiales (óxidos metálicos, polímeros conductores, cristales piezoeléctricos, etc.), modifican sus propiedades eléctricas cuando interaccionan con los compuestos volátiles, proporcionando una </w:t>
       </w:r>
       <w:r>
         <w:rPr>
@@ -345,7 +417,15 @@
         <w:t xml:space="preserve">En los últimos años, ha aparecido en el mercado un nuevo tipo de nariz electrónica, basado en la espectrometría de masas (HS-MS). </w:t>
       </w:r>
       <w:r>
-        <w:t>Mediante esta técnica, cuya capacidad analítica ha sido suficientemente probada, se consigue obtener un espectro que equivaldría a un multisensor con tantos sensores como iones formados. Para este tipo de sistema, la presencia de componentes como el etanol no supone un problema, puesto que las interferencias pueden soslayarse prescindiendo de analizar sus iones característicos. Otra ventaja sustancial es el hecho de que no sea necesario ningún acondicionamiento del sensor ni de la muestra, con lo que es una técnica muy competitiva para el control de calidad.</w:t>
+        <w:t xml:space="preserve">Mediante esta técnica, cuya capacidad analítica ha sido suficientemente probada, se consigue obtener un espectro que equivaldría a un </w:t>
+      </w:r>
+      <w:proofErr w:type="spellStart"/>
+      <w:r>
+        <w:t>multisensor</w:t>
+      </w:r>
+      <w:proofErr w:type="spellEnd"/>
+      <w:r>
+        <w:t xml:space="preserve"> con tantos sensores como iones formados. Para este tipo de sistema, la presencia de componentes como el etanol no supone un problema, puesto que las interferencias pueden soslayarse prescindiendo de analizar sus iones característicos. Otra ventaja sustancial es el hecho de que no sea necesario ningún acondicionamiento del sensor ni de la muestra, con lo que es una técnica muy competitiva para el control de calidad.</w:t>
       </w:r>
     </w:p>
     <w:p>
@@ -391,7 +471,15 @@
         </w:numPr>
       </w:pPr>
       <w:r>
-        <w:t>(Se puede añadir a la documentación una pequeña explicación de como funciona el olfato humano para añadir un poco más de contexto</w:t>
+        <w:t xml:space="preserve">(Se puede añadir a la documentación una pequeña explicación de </w:t>
+      </w:r>
+      <w:proofErr w:type="spellStart"/>
+      <w:r>
+        <w:t>como</w:t>
+      </w:r>
+      <w:proofErr w:type="spellEnd"/>
+      <w:r>
+        <w:t xml:space="preserve"> funciona el olfato humano para añadir un poco más de contexto</w:t>
       </w:r>
       <w:r>
         <w:t xml:space="preserve"> y en la presentación hacer una explicación super rápida)</w:t>
@@ -407,7 +495,15 @@
       </w:pPr>
       <w:r>
         <w:lastRenderedPageBreak/>
-        <w:t>Los sistemas de reconocimiento de aroma aparecieron en el mercado hacia inicios de los años 90, con el sistema Modular Sensor System - MOSES I. Posteriormente, muchas narices electrónicas han salido al mercado.</w:t>
+        <w:t xml:space="preserve">Los sistemas de reconocimiento de aroma aparecieron en el mercado hacia inicios de los años 90, con el sistema Modular Sensor </w:t>
+      </w:r>
+      <w:proofErr w:type="spellStart"/>
+      <w:r>
+        <w:t>System</w:t>
+      </w:r>
+      <w:proofErr w:type="spellEnd"/>
+      <w:r>
+        <w:t xml:space="preserve"> - MOSES I. Posteriormente, muchas narices electrónicas han salido al mercado.</w:t>
       </w:r>
     </w:p>
     <w:p>
@@ -470,7 +566,17 @@
         </w:numPr>
       </w:pPr>
       <w:r>
-        <w:t>Las respuestas de las señales generadas por los sensores se analizan usando diferentes métodos analíticos. Los más reconocidos son: el análisis gráfico (diagrama de barras y diagramas polares), el análisis estadístico multivariado (análisis de componentes principales (PCA), el análisis de función de discriminantes (DFA) y el análisis de clusters (CA)), análisis de redes (redes neuronales artificiales (ANN) y funciones de base radial (RBF)). La elección del método depende de los datos disponibles y del tipo de resultado requerido.</w:t>
+        <w:t xml:space="preserve">Las respuestas de las señales generadas por los sensores se analizan usando diferentes métodos analíticos. Los más reconocidos son: el análisis gráfico (diagrama de barras y diagramas polares), el análisis estadístico multivariado (análisis de componentes principales (PCA), el análisis de función de discriminantes (DFA) y el análisis de </w:t>
+      </w:r>
+      <w:proofErr w:type="spellStart"/>
+      <w:proofErr w:type="gramStart"/>
+      <w:r>
+        <w:t>clusters</w:t>
+      </w:r>
+      <w:proofErr w:type="spellEnd"/>
+      <w:proofErr w:type="gramEnd"/>
+      <w:r>
+        <w:t xml:space="preserve"> (CA)), análisis de redes (redes neuronales artificiales (ANN) y funciones de base radial (RBF)). La elección del método depende de los datos disponibles y del tipo de resultado requerido.</w:t>
       </w:r>
     </w:p>
     <w:p>
@@ -550,7 +656,15 @@
         </w:numPr>
       </w:pPr>
       <w:r>
-        <w:t xml:space="preserve">La investigación basada en microfluidos ha demostrado el potencial de detección de medicamentos debido a su pequeño tamaño y tiempos de análisis rápidos, </w:t>
+        <w:t xml:space="preserve">La investigación basada en </w:t>
+      </w:r>
+      <w:proofErr w:type="spellStart"/>
+      <w:r>
+        <w:t>microfluidos</w:t>
+      </w:r>
+      <w:proofErr w:type="spellEnd"/>
+      <w:r>
+        <w:t xml:space="preserve"> ha demostrado el potencial de detección de medicamentos debido a su pequeño tamaño y tiempos de análisis rápidos, </w:t>
       </w:r>
       <w:r>
         <w:lastRenderedPageBreak/>
@@ -775,7 +889,15 @@
         </w:numPr>
       </w:pPr>
       <w:r>
-        <w:t xml:space="preserve">La identificación del compuesto implicó un enfoque de dos puntas: primero, los índices de retención de Kovats, calculados usando n-alcanos (R-8769, Sigma Chemical Co., St. Louis, MO, Estados Unidos), fueron empleados. En segundo lugar, los espectros de masas obtenidos se compararon con la biblioteca NIST/EPA/NIH, con una calidad mínima de coincidencia del 90% requerida. Además, la identidad de los compuestos específicos se verificó comparando sus </w:t>
+        <w:t xml:space="preserve">La identificación del compuesto implicó un enfoque de dos puntas: primero, los índices de retención de </w:t>
+      </w:r>
+      <w:proofErr w:type="spellStart"/>
+      <w:r>
+        <w:t>Kovats</w:t>
+      </w:r>
+      <w:proofErr w:type="spellEnd"/>
+      <w:r>
+        <w:t xml:space="preserve">, calculados usando n-alcanos (R-8769, Sigma Chemical Co., St. Louis, MO, Estados Unidos), fueron empleados. En segundo lugar, los espectros de masas obtenidos se compararon con la biblioteca NIST/EPA/NIH, con una calidad mínima de coincidencia del 90% requerida. Además, la identidad de los compuestos específicos se verificó comparando sus </w:t>
       </w:r>
       <w:r>
         <w:lastRenderedPageBreak/>
@@ -846,6 +968,7 @@
         </w:rPr>
         <w:t xml:space="preserve">Para obtener un valor representativo para cada ciclo de medición, se implementó un algoritmo de manipulación de línea de base. Este valor característico se calculó como la diferencia proporcional entre un valor de referencia (V </w:t>
       </w:r>
+      <w:proofErr w:type="spellStart"/>
       <w:r>
         <w:rPr>
           <w:rFonts w:ascii="Times New Roman" w:eastAsia="Times New Roman" w:hAnsi="Times New Roman" w:cs="Times New Roman"/>
@@ -856,6 +979,7 @@
         </w:rPr>
         <w:t>ref</w:t>
       </w:r>
+      <w:proofErr w:type="spellEnd"/>
       <w:r>
         <w:rPr>
           <w:rFonts w:ascii="Times New Roman" w:eastAsia="Times New Roman" w:hAnsi="Times New Roman" w:cs="Times New Roman"/>
@@ -884,6 +1008,7 @@
         </w:rPr>
         <w:t xml:space="preserve">). El valor de referencia (V </w:t>
       </w:r>
+      <w:proofErr w:type="spellStart"/>
       <w:r>
         <w:rPr>
           <w:rFonts w:ascii="Times New Roman" w:eastAsia="Times New Roman" w:hAnsi="Times New Roman" w:cs="Times New Roman"/>
@@ -894,6 +1019,7 @@
         </w:rPr>
         <w:t>ref</w:t>
       </w:r>
+      <w:proofErr w:type="spellEnd"/>
       <w:r>
         <w:rPr>
           <w:rFonts w:ascii="Times New Roman" w:eastAsia="Times New Roman" w:hAnsi="Times New Roman" w:cs="Times New Roman"/>
@@ -958,6 +1084,7 @@
           <w:lang w:eastAsia="es-ES"/>
         </w:rPr>
       </w:pPr>
+      <w:proofErr w:type="spellStart"/>
       <w:r>
         <w:rPr>
           <w:rFonts w:ascii="GyrePagellaMathJax_Normal" w:eastAsia="Times New Roman" w:hAnsi="GyrePagellaMathJax_Normal" w:cs="Times New Roman"/>
@@ -976,6 +1103,8 @@
         </w:rPr>
         <w:t>f</w:t>
       </w:r>
+      <w:proofErr w:type="spellEnd"/>
+      <w:proofErr w:type="gramStart"/>
       <w:r>
         <w:rPr>
           <w:rFonts w:ascii="GyrePagellaMathJax_Main" w:eastAsia="Times New Roman" w:hAnsi="GyrePagellaMathJax_Main" w:cs="Times New Roman"/>
@@ -994,6 +1123,8 @@
         </w:rPr>
         <w:t>(</w:t>
       </w:r>
+      <w:proofErr w:type="spellStart"/>
+      <w:proofErr w:type="gramEnd"/>
       <w:r>
         <w:rPr>
           <w:rFonts w:ascii="GyrePagellaMathJax_Normal" w:eastAsia="Times New Roman" w:hAnsi="GyrePagellaMathJax_Normal" w:cs="Times New Roman"/>
@@ -1012,6 +1143,7 @@
         </w:rPr>
         <w:t>Ref</w:t>
       </w:r>
+      <w:proofErr w:type="spellEnd"/>
       <w:r>
         <w:rPr>
           <w:rFonts w:ascii="GyrePagellaMathJax_Main" w:eastAsia="Times New Roman" w:hAnsi="GyrePagellaMathJax_Main" w:cs="Times New Roman"/>
@@ -1084,6 +1216,7 @@
         </w:rPr>
         <w:t xml:space="preserve"> </w:t>
       </w:r>
+      <w:proofErr w:type="gramStart"/>
       <w:r>
         <w:rPr>
           <w:rFonts w:ascii="GyrePagellaMathJax_Normal" w:eastAsia="Times New Roman" w:hAnsi="GyrePagellaMathJax_Normal" w:cs="Times New Roman"/>
@@ -1109,7 +1242,17 @@
           <w:szCs w:val="26"/>
           <w:lang w:eastAsia="es-ES"/>
         </w:rPr>
-        <w:t>×100−1</w:t>
+        <w:t>×</w:t>
+      </w:r>
+      <w:proofErr w:type="gramEnd"/>
+      <w:r>
+        <w:rPr>
+          <w:rFonts w:ascii="GyrePagellaMathJax_Main" w:eastAsia="Times New Roman" w:hAnsi="GyrePagellaMathJax_Main" w:cs="Times New Roman"/>
+          <w:sz w:val="26"/>
+          <w:szCs w:val="26"/>
+          <w:lang w:eastAsia="es-ES"/>
+        </w:rPr>
+        <w:t>100−1</w:t>
       </w:r>
     </w:p>
     <w:p>
@@ -1143,7 +1286,15 @@
         </w:numPr>
       </w:pPr>
       <w:r>
-        <w:t>Como regla general, la revisión de la literatura discute los aspectos relacionados con diversas aplicaciones, así como el desarrollo de soluciones efectivas. Sin embargo, la principal limitación en la expansión del uso de e-noses como herramienta de monitoreo ambiental es su complejidad y falta de estándares específicos, que pueden corregirse a través de aplicaciones de métodos de procesamiento de datos apropiados.</w:t>
+        <w:t>Como regla general, la revisión de la literatura discute los aspectos relacionados con diversas aplicaciones, así como el desarrollo de soluciones efectivas. Sin embargo, la principal limitación en la expansión del uso de e-</w:t>
+      </w:r>
+      <w:proofErr w:type="spellStart"/>
+      <w:r>
+        <w:t>noses</w:t>
+      </w:r>
+      <w:proofErr w:type="spellEnd"/>
+      <w:r>
+        <w:t xml:space="preserve"> como herramienta de monitoreo ambiental es su complejidad y falta de estándares específicos, que pueden corregirse a través de aplicaciones de métodos de procesamiento de datos apropiados.</w:t>
       </w:r>
     </w:p>
     <w:p>
@@ -1155,7 +1306,15 @@
         </w:numPr>
       </w:pPr>
       <w:r>
-        <w:t>Entre los diferentes tipos de sensores químicos empleados en la tecnología de nariz electrónica, los sensores semiconductores de óxido metálico (MOX) son la clase más utilizada. Según los datos de la base de datos Scopus (estadística del 17 de marzo de 2023), entre los 3023 sistemas de nariz electrónica reportados desde 1974 hasta hoy en día, más del 35% (1073 sistemas de detección) se basaron en la tecnología de los sensores MOX.</w:t>
+        <w:t xml:space="preserve">Entre los diferentes tipos de sensores químicos empleados en la tecnología de nariz electrónica, los sensores semiconductores de óxido metálico (MOX) son la clase más utilizada. Según los datos de la base de datos </w:t>
+      </w:r>
+      <w:proofErr w:type="spellStart"/>
+      <w:r>
+        <w:t>Scopus</w:t>
+      </w:r>
+      <w:proofErr w:type="spellEnd"/>
+      <w:r>
+        <w:t xml:space="preserve"> (estadística del 17 de marzo de 2023), entre los 3023 sistemas de nariz electrónica reportados desde 1974 hasta hoy en día, más del 35% (1073 sistemas de detección) se basaron en la tecnología de los sensores MOX.</w:t>
       </w:r>
     </w:p>
     <w:p>
@@ -1183,7 +1342,15 @@
       </w:r>
       <w:r>
         <w:lastRenderedPageBreak/>
-        <w:t>estaban hechos de óxido de zinc ZnO, que fue seguido por el uso de materiales tales como SnO</w:t>
+        <w:t xml:space="preserve">estaban hechos de óxido de zinc </w:t>
+      </w:r>
+      <w:proofErr w:type="spellStart"/>
+      <w:r>
+        <w:t>ZnO</w:t>
+      </w:r>
+      <w:proofErr w:type="spellEnd"/>
+      <w:r>
+        <w:t>, que fue seguido por el uso de materiales tales como SnO</w:t>
       </w:r>
       <w:r>
         <w:rPr>
@@ -1276,7 +1443,23 @@
         </w:numPr>
       </w:pPr>
       <w:r>
-        <w:t>Dependiendo de la técnica para producir la capa sensible al gas, los sensores se dividen en sensores de película delgada con un espesor de capa de 5 nm a 2 μm y sensores de película gruesa con un espesor de capa de 10-300 μm. Los sensores de película gruesa, en comparación con los de película delgada, son menos susceptibles a envenenamiento, son más duraderos y exhiben una mayor sensibilidad.</w:t>
+        <w:t xml:space="preserve">Dependiendo de la técnica para producir la capa sensible al gas, los sensores se dividen en sensores de película delgada con un espesor de capa de 5 nm a 2 </w:t>
+      </w:r>
+      <w:proofErr w:type="spellStart"/>
+      <w:r>
+        <w:t>μm</w:t>
+      </w:r>
+      <w:proofErr w:type="spellEnd"/>
+      <w:r>
+        <w:t xml:space="preserve"> y sensores de película gruesa con un espesor de capa de 10-300 </w:t>
+      </w:r>
+      <w:proofErr w:type="spellStart"/>
+      <w:r>
+        <w:t>μm</w:t>
+      </w:r>
+      <w:proofErr w:type="spellEnd"/>
+      <w:r>
+        <w:t>. Los sensores de película gruesa, en comparación con los de película delgada, son menos susceptibles a envenenamiento, son más duraderos y exhiben una mayor sensibilidad.</w:t>
       </w:r>
     </w:p>
     <w:p>
@@ -1288,7 +1471,15 @@
         </w:numPr>
       </w:pPr>
       <w:r>
-        <w:t>Los sensores MOX permiten medir las concentraciones de gas a través del fenómeno de cambiar la conductividad eléctrica de un elemento receptor-transductor de semiconductores. En los sensores MOX, el elemento de medición es generalmente una sinterización de dióxido de estaño. Dependiendo del propósito del sensor, la sinterización semiconductora contiene varios dopantes en forma de metales preciosos. El cambio en la conductividad eléctrica en la capa semiconductora es el resultado de un proceso de quimiosorción, es decir, la formación de enlaces químicos entre las moléculas de gas y el semiconductor. Esto conduce a un cambio en la concentración de portadores de corriente en la superficie del semiconductor y, por lo tanto, a un cambio en la conductividad eléctrica.</w:t>
+        <w:t xml:space="preserve">Los sensores MOX permiten medir las concentraciones de gas a través del fenómeno de cambiar la conductividad eléctrica de un elemento receptor-transductor de semiconductores. En los sensores MOX, el elemento de medición es generalmente una sinterización de dióxido de estaño. Dependiendo del propósito del sensor, la sinterización semiconductora contiene varios dopantes en forma de metales preciosos. El cambio en la conductividad eléctrica en la capa semiconductora es el resultado de un proceso de </w:t>
+      </w:r>
+      <w:proofErr w:type="spellStart"/>
+      <w:r>
+        <w:t>quimiosorción</w:t>
+      </w:r>
+      <w:proofErr w:type="spellEnd"/>
+      <w:r>
+        <w:t>, es decir, la formación de enlaces químicos entre las moléculas de gas y el semiconductor. Esto conduce a un cambio en la concentración de portadores de corriente en la superficie del semiconductor y, por lo tanto, a un cambio en la conductividad eléctrica.</w:t>
       </w:r>
     </w:p>
     <w:p>
@@ -1309,7 +1500,12 @@
         <w:ind w:left="2844" w:firstLine="696"/>
       </w:pPr>
       <w:r>
-        <w:t>R=RZ</w:t>
+        <w:t>R=</w:t>
+      </w:r>
+      <w:proofErr w:type="spellStart"/>
+      <w:proofErr w:type="gramStart"/>
+      <w:r>
+        <w:t>RZ</w:t>
       </w:r>
       <w:r>
         <w:rPr>
@@ -1320,6 +1516,7 @@
       <w:r>
         <w:t>exP</w:t>
       </w:r>
+      <w:proofErr w:type="spellEnd"/>
       <w:r>
         <w:rPr>
           <w:rFonts w:ascii="Cambria Math" w:hAnsi="Cambria Math" w:cs="Cambria Math"/>
@@ -1327,7 +1524,12 @@
         <w:t>⁡</w:t>
       </w:r>
       <w:r>
-        <w:t>(WGkB</w:t>
+        <w:t>(</w:t>
+      </w:r>
+      <w:proofErr w:type="spellStart"/>
+      <w:proofErr w:type="gramEnd"/>
+      <w:r>
+        <w:t>WGkB</w:t>
       </w:r>
       <w:r>
         <w:rPr>
@@ -1336,7 +1538,11 @@
         <w:t>⁢</w:t>
       </w:r>
       <w:r>
-        <w:t xml:space="preserve">T), </w:t>
+        <w:t>T</w:t>
+      </w:r>
+      <w:proofErr w:type="spellEnd"/>
+      <w:r>
+        <w:t xml:space="preserve">), </w:t>
       </w:r>
     </w:p>
     <w:p>
@@ -1374,7 +1580,15 @@
         </w:numPr>
       </w:pPr>
       <w:r>
-        <w:t>A baja temperatura, domina la adsorción física débil por las fuerzas de van der Waals, con una fuerza de unión de menos de 0,1 eV. Entre las moléculas de gas adsorbido y la superficie semiconductora, no hay intercambio de carga eléctrica y el cambio resultante en la concentración de portadores en la capa sensible al gas, por lo que la adsorción a baja temperatura no causa un cambio en la conductividad</w:t>
+        <w:t xml:space="preserve">A baja temperatura, domina la adsorción física débil por las fuerzas de van </w:t>
+      </w:r>
+      <w:proofErr w:type="spellStart"/>
+      <w:r>
+        <w:t>der</w:t>
+      </w:r>
+      <w:proofErr w:type="spellEnd"/>
+      <w:r>
+        <w:t xml:space="preserve"> Waals, con una fuerza de unión de menos de 0,1 eV. Entre las moléculas de gas adsorbido y la superficie semiconductora, no hay intercambio de carga eléctrica y el cambio resultante en la concentración de portadores en la capa sensible al gas, por lo que la adsorción a baja temperatura no causa un cambio en la conductividad</w:t>
       </w:r>
       <w:r>
         <w:t>.</w:t>
@@ -1450,23 +1664,19 @@
           <w:szCs w:val="24"/>
           <w:lang w:eastAsia="es-ES"/>
         </w:rPr>
-        <w:t>La co-reacción de los contaminantes gaseosos;</w:t>
-      </w:r>
-    </w:p>
-    <w:p>
-      <w:pPr>
-        <w:numPr>
-          <w:ilvl w:val="1"/>
-          <w:numId w:val="10"/>
-        </w:numPr>
-        <w:spacing w:before="100" w:beforeAutospacing="1" w:after="100" w:afterAutospacing="1" w:line="240" w:lineRule="auto"/>
+        <w:t xml:space="preserve">La </w:t>
+      </w:r>
+      <w:proofErr w:type="spellStart"/>
+      <w:r>
         <w:rPr>
           <w:rFonts w:ascii="Times New Roman" w:eastAsia="Times New Roman" w:hAnsi="Times New Roman" w:cs="Times New Roman"/>
           <w:sz w:val="24"/>
           <w:szCs w:val="24"/>
           <w:lang w:eastAsia="es-ES"/>
         </w:rPr>
-      </w:pPr>
+        <w:t>co-reacción</w:t>
+      </w:r>
+      <w:proofErr w:type="spellEnd"/>
       <w:r>
         <w:rPr>
           <w:rFonts w:ascii="Times New Roman" w:eastAsia="Times New Roman" w:hAnsi="Times New Roman" w:cs="Times New Roman"/>
@@ -1474,6 +1684,30 @@
           <w:szCs w:val="24"/>
           <w:lang w:eastAsia="es-ES"/>
         </w:rPr>
+        <w:t xml:space="preserve"> de los contaminantes gaseosos;</w:t>
+      </w:r>
+    </w:p>
+    <w:p>
+      <w:pPr>
+        <w:numPr>
+          <w:ilvl w:val="1"/>
+          <w:numId w:val="10"/>
+        </w:numPr>
+        <w:spacing w:before="100" w:beforeAutospacing="1" w:after="100" w:afterAutospacing="1" w:line="240" w:lineRule="auto"/>
+        <w:rPr>
+          <w:rFonts w:ascii="Times New Roman" w:eastAsia="Times New Roman" w:hAnsi="Times New Roman" w:cs="Times New Roman"/>
+          <w:sz w:val="24"/>
+          <w:szCs w:val="24"/>
+          <w:lang w:eastAsia="es-ES"/>
+        </w:rPr>
+      </w:pPr>
+      <w:r>
+        <w:rPr>
+          <w:rFonts w:ascii="Times New Roman" w:eastAsia="Times New Roman" w:hAnsi="Times New Roman" w:cs="Times New Roman"/>
+          <w:sz w:val="24"/>
+          <w:szCs w:val="24"/>
+          <w:lang w:eastAsia="es-ES"/>
+        </w:rPr>
         <w:t>La presencia de vapor de agua.</w:t>
       </w:r>
     </w:p>
@@ -1583,7 +1817,23 @@
         <w:t>2</w:t>
       </w:r>
       <w:r>
-        <w:t>, SnO es inestable a temperaturas superiores a 270 °C. En general, los sensores de gas están hechos de SnO poroso grueso</w:t>
+        <w:t xml:space="preserve">, </w:t>
+      </w:r>
+      <w:proofErr w:type="spellStart"/>
+      <w:r>
+        <w:t>SnO</w:t>
+      </w:r>
+      <w:proofErr w:type="spellEnd"/>
+      <w:r>
+        <w:t xml:space="preserve"> es inestable a temperaturas superiores a 270 °C. En general, los sensores de gas están hechos de </w:t>
+      </w:r>
+      <w:proofErr w:type="spellStart"/>
+      <w:r>
+        <w:t>SnO</w:t>
+      </w:r>
+      <w:proofErr w:type="spellEnd"/>
+      <w:r>
+        <w:t xml:space="preserve"> poroso grueso</w:t>
       </w:r>
       <w:r>
         <w:rPr>
@@ -1604,7 +1854,31 @@
         </w:numPr>
       </w:pPr>
       <w:r>
-        <w:t>Los sensores de gas de óxido de zinc (ZnO) se utilizan para la detección de gases, monitoreo ambiental, procesos industriales y aplicaciones de análisis de respiración. En el contexto de los sensores de gas de óxido de zinc (ZnO), el monitoreo ambiental y los procesos industriales abarcan una gama de aplicaciones donde estos sensores se utilizan para la detección y el análisis de gases. Por un lado, está el monitoreo ambiental de la calidad del aire interior. Los sensores de gas ZnO se utilizan para monitorear y evaluar la calidad del aire interior en varios entornos, como hogares, oficinas, escuelas y edificios públicos. Pueden detectar gases liberados de materiales de construcción, muebles, productos de limpieza y otras fuentes de contaminación en interiores.</w:t>
+        <w:t>Los sensores de gas de óxido de zinc (</w:t>
+      </w:r>
+      <w:proofErr w:type="spellStart"/>
+      <w:r>
+        <w:t>ZnO</w:t>
+      </w:r>
+      <w:proofErr w:type="spellEnd"/>
+      <w:r>
+        <w:t>) se utilizan para la detección de gases, monitoreo ambiental, procesos industriales y aplicaciones de análisis de respiración. En el contexto de los sensores de gas de óxido de zinc (</w:t>
+      </w:r>
+      <w:proofErr w:type="spellStart"/>
+      <w:r>
+        <w:t>ZnO</w:t>
+      </w:r>
+      <w:proofErr w:type="spellEnd"/>
+      <w:r>
+        <w:t xml:space="preserve">), el monitoreo ambiental y los procesos industriales abarcan una gama de aplicaciones donde estos sensores se utilizan para la detección y el análisis de gases. Por un lado, está el monitoreo ambiental de la calidad del aire interior. Los sensores de gas </w:t>
+      </w:r>
+      <w:proofErr w:type="spellStart"/>
+      <w:r>
+        <w:t>ZnO</w:t>
+      </w:r>
+      <w:proofErr w:type="spellEnd"/>
+      <w:r>
+        <w:t xml:space="preserve"> se utilizan para monitorear y evaluar la calidad del aire interior en varios entornos, como hogares, oficinas, escuelas y edificios públicos. Pueden detectar gases liberados de materiales de construcción, muebles, productos de limpieza y otras fuentes de contaminación en interiores.</w:t>
       </w:r>
     </w:p>
     <w:p>
@@ -1616,7 +1890,15 @@
         </w:numPr>
       </w:pPr>
       <w:r>
-        <w:t>Los sensores de gas de óxido de zinc (ZnO) se utilizan para la detección de gases, monitoreo ambiental, procesos industriales y aplicaciones de análisis de respiración.</w:t>
+        <w:t>Los sensores de gas de óxido de zinc (</w:t>
+      </w:r>
+      <w:proofErr w:type="spellStart"/>
+      <w:r>
+        <w:t>ZnO</w:t>
+      </w:r>
+      <w:proofErr w:type="spellEnd"/>
+      <w:r>
+        <w:t>) se utilizan para la detección de gases, monitoreo ambiental, procesos industriales y aplicaciones de análisis de respiración.</w:t>
       </w:r>
       <w:r>
         <w:t xml:space="preserve"> </w:t>
@@ -1634,7 +1916,15 @@
         </w:numPr>
       </w:pPr>
       <w:r>
-        <w:t>Oxido de Indio m</w:t>
+        <w:t xml:space="preserve">Oxido de </w:t>
+      </w:r>
+      <w:proofErr w:type="gramStart"/>
+      <w:r>
+        <w:t>Indio</w:t>
+      </w:r>
+      <w:proofErr w:type="gramEnd"/>
+      <w:r>
+        <w:t xml:space="preserve"> m</w:t>
       </w:r>
       <w:r>
         <w:t xml:space="preserve">onitorean y regulan los niveles de contaminantes como los óxidos de nitrógeno (NO </w:t>
@@ -1687,8 +1977,13 @@
           <w:numId w:val="10"/>
         </w:numPr>
       </w:pPr>
-      <w:r>
-        <w:t>CuO es un semiconductor de tipo p con un espacio de banda estrecho de 1,2 eV. El óxido de cobre conocido como óxido cúprico es negro. Otro óxido de cobre es el óxido cuproso de color rojo (Cu</w:t>
+      <w:proofErr w:type="spellStart"/>
+      <w:r>
+        <w:t>CuO</w:t>
+      </w:r>
+      <w:proofErr w:type="spellEnd"/>
+      <w:r>
+        <w:t xml:space="preserve"> es un semiconductor de tipo p con un espacio de banda estrecho de 1,2 eV. El óxido de cobre conocido como óxido cúprico es negro. Otro óxido de cobre es el óxido cuproso de color rojo (Cu</w:t>
       </w:r>
       <w:r>
         <w:rPr>
@@ -1697,13 +1992,26 @@
         <w:t>2</w:t>
       </w:r>
       <w:r>
-        <w:t>O), que es de color rojo y tiene un grieta de 2 a 2,17 eV</w:t>
+        <w:t xml:space="preserve">O), que es de color rojo y tiene </w:t>
+      </w:r>
+      <w:proofErr w:type="gramStart"/>
+      <w:r>
+        <w:t>un grieta</w:t>
+      </w:r>
+      <w:proofErr w:type="gramEnd"/>
+      <w:r>
+        <w:t xml:space="preserve"> de 2 a 2,17 eV</w:t>
       </w:r>
       <w:r>
         <w:t xml:space="preserve">. </w:t>
       </w:r>
-      <w:r>
-        <w:t>CuO tiene una estructura cristalina monoclínica.</w:t>
+      <w:proofErr w:type="spellStart"/>
+      <w:r>
+        <w:t>CuO</w:t>
+      </w:r>
+      <w:proofErr w:type="spellEnd"/>
+      <w:r>
+        <w:t xml:space="preserve"> tiene una estructura cristalina monoclínica.</w:t>
       </w:r>
     </w:p>
     <w:p>
@@ -1714,8 +2022,13 @@
           <w:numId w:val="10"/>
         </w:numPr>
       </w:pPr>
-      <w:r>
-        <w:t>CuO se ha utilizado para diversas aplicaciones tales como baterías, biosensores, transistores de película delgada, sensores UV, células solares, sensores de humedad y sensores de gas</w:t>
+      <w:proofErr w:type="spellStart"/>
+      <w:r>
+        <w:t>CuO</w:t>
+      </w:r>
+      <w:proofErr w:type="spellEnd"/>
+      <w:r>
+        <w:t xml:space="preserve"> se ha utilizado para diversas aplicaciones tales como baterías, biosensores, transistores de película delgada, sensores UV, células solares, sensores de humedad y sensores de gas</w:t>
       </w:r>
       <w:r>
         <w:t xml:space="preserve">. </w:t>
@@ -1730,8 +2043,13 @@
         <w:t>2</w:t>
       </w:r>
       <w:r>
-        <w:t>Los sensores basados en O se han abordado menos en aplicaciones de detección de gas en comparación con CuO</w:t>
-      </w:r>
+        <w:t xml:space="preserve">Los sensores basados en O se han abordado menos en aplicaciones de detección de gas en comparación con </w:t>
+      </w:r>
+      <w:proofErr w:type="spellStart"/>
+      <w:r>
+        <w:t>CuO</w:t>
+      </w:r>
+      <w:proofErr w:type="spellEnd"/>
       <w:r>
         <w:t>.</w:t>
       </w:r>
@@ -1791,7 +2109,15 @@
         </w:numPr>
       </w:pPr>
       <w:r>
-        <w:t>Los principales problemas de los sensores de gas de bajo coste se resumen en; están relacionados principalmente con (i) cuestiones relacionadas con los principios de trabajo de los sensores, como los límites dinámicos, la respuesta no lineal, los errores sistemáticos y la deriva de la señal, así como (ii) los problemas asignables a los errores externos, como la baja selectividad y la dependencia ambiental.</w:t>
+        <w:t>Los principales problemas de los sensores de gas de bajo coste se resumen en; están relacionados principalmente con (i) cuestiones relacionadas con los principios de trabajo de los sensores, como los límites dinámicos, la respuesta no lineal, los errores sistemáticos y la deriva de la señal, así como (</w:t>
+      </w:r>
+      <w:proofErr w:type="spellStart"/>
+      <w:r>
+        <w:t>ii</w:t>
+      </w:r>
+      <w:proofErr w:type="spellEnd"/>
+      <w:r>
+        <w:t>) los problemas asignables a los errores externos, como la baja selectividad y la dependencia ambiental.</w:t>
       </w:r>
     </w:p>
     <w:p>
@@ -1922,7 +2248,15 @@
         <w:t>premio. El entrenamiento consiste en “ir complicando el juego”</w:t>
       </w:r>
       <w:r>
-        <w:t xml:space="preserve"> para que detecte la sustancia cada vez en una situación mas complicada, se le enseña a marcar donde y se le premia por ello.</w:t>
+        <w:t xml:space="preserve"> para que detecte la sustancia cada vez en una situación </w:t>
+      </w:r>
+      <w:proofErr w:type="spellStart"/>
+      <w:r>
+        <w:t>mas</w:t>
+      </w:r>
+      <w:proofErr w:type="spellEnd"/>
+      <w:r>
+        <w:t xml:space="preserve"> complicada, se le enseña a marcar donde y se le premia por ello.</w:t>
       </w:r>
     </w:p>
     <w:p>
@@ -1934,7 +2268,15 @@
         </w:numPr>
       </w:pPr>
       <w:r>
-        <w:t>El estado de animo de los perros puede variar</w:t>
+        <w:t xml:space="preserve">El estado de </w:t>
+      </w:r>
+      <w:proofErr w:type="spellStart"/>
+      <w:r>
+        <w:t>animo</w:t>
+      </w:r>
+      <w:proofErr w:type="spellEnd"/>
+      <w:r>
+        <w:t xml:space="preserve"> de los perros puede variar</w:t>
       </w:r>
       <w:r>
         <w:t xml:space="preserve"> dependiendo del estado de ánimo del guía, lo que puede afectar a que esté más distraído o con menos ganas de “jugar”.</w:t>
@@ -1949,7 +2291,15 @@
         </w:numPr>
       </w:pPr>
       <w:r>
-        <w:t>Puede haber perros mejores o peores en este ámbito pero, por muy bueno que sea, es importante el trabajo del guía para que no se distraiga, que se centre e</w:t>
+        <w:t xml:space="preserve">Puede haber perros mejores o peores en este </w:t>
+      </w:r>
+      <w:proofErr w:type="gramStart"/>
+      <w:r>
+        <w:t>ámbito</w:t>
+      </w:r>
+      <w:proofErr w:type="gramEnd"/>
+      <w:r>
+        <w:t xml:space="preserve"> pero, por muy bueno que sea, es importante el trabajo del guía para que no se distraiga, que se centre e</w:t>
       </w:r>
       <w:r>
         <w:t xml:space="preserve">n lo que tiene que hacer y todo funcione bien. Aunque el perro sea el que huela, es un trabajo de </w:t>
@@ -2197,7 +2547,15 @@
         </w:numPr>
       </w:pPr>
       <w:r>
-        <w:t>(Decir que sensores se usan y añadir una tabla con las especificaciones de los sensores)</w:t>
+        <w:t>(</w:t>
+      </w:r>
+      <w:proofErr w:type="gramStart"/>
+      <w:r>
+        <w:t>Decir</w:t>
+      </w:r>
+      <w:proofErr w:type="gramEnd"/>
+      <w:r>
+        <w:t xml:space="preserve"> que sensores se usan y añadir una tabla con las especificaciones de los sensores)</w:t>
       </w:r>
     </w:p>
     <w:p>
@@ -4501,6 +4859,7 @@
   <w:style w:type="character" w:default="1" w:styleId="Fuentedeprrafopredeter">
     <w:name w:val="Default Paragraph Font"/>
     <w:uiPriority w:val="1"/>
+    <w:semiHidden/>
     <w:unhideWhenUsed/>
   </w:style>
   <w:style w:type="table" w:default="1" w:styleId="Tablanormal">

</xml_diff>